<commit_message>
docs: update team roles and branch workflow
Clarify TV1 as team lead and TV2-TV4 as independent contributors who create branches, push code, and open pull requests.
</commit_message>
<xml_diff>
--- a/Bang_phan_cong_cong_viec_CloudServiceStore.docx
+++ b/Bang_phan_cong_cong_viec_CloudServiceStore.docx
@@ -185,23 +185,13 @@
               <w:spacing w:after="0" w:line="252" w:lineRule="auto"/>
             </w:pPr>
             <w:r>
-              <w:t>TV1, TV2</w:t>
-            </w:r>
-            <w:r>
-              <w:t xml:space="preserve"> Huy</w:t>
-            </w:r>
-            <w:r>
-              <w:t>, TV3</w:t>
-            </w:r>
-            <w:r>
-              <w:t xml:space="preserve"> Duy</w:t>
-            </w:r>
-            <w:r>
-              <w:t>, TV4</w:t>
-            </w:r>
-            <w:r>
-              <w:t xml:space="preserve"> Hân</w:t>
-            </w:r>
+              <w:t>TV1 (trưởng nhóm), TV2 Huy, TV3 Duy, TV4 Hân</w:t>
+            </w:r>
+            <w:r/>
+            <w:r/>
+            <w:r/>
+            <w:r/>
+            <w:r/>
           </w:p>
         </w:tc>
       </w:tr>
@@ -350,7 +340,7 @@
               <w:spacing w:after="0" w:line="252" w:lineRule="auto"/>
             </w:pPr>
             <w:r>
-              <w:t>Repository chính thức do giảng viên cung cấp</w:t>
+              <w:t>HieuIPO/CloudServiceStore-Team-Contributions (Private)</w:t>
             </w:r>
           </w:p>
         </w:tc>
@@ -3053,7 +3043,7 @@
               <w:spacing w:after="0" w:line="252" w:lineRule="auto"/>
             </w:pPr>
             <w:r>
-              <w:t>Branch đúng tên trong bảng phân công.</w:t>
+              <w:t>TV2, TV3, TV4 tự tạo branch theo bảng phân công, push lên repo và mở PR; TV1 review/tích hợp.</w:t>
             </w:r>
           </w:p>
         </w:tc>
@@ -4232,8 +4222,7 @@
         <w:jc w:val="both"/>
       </w:pPr>
       <w:r>
-        <w:lastRenderedPageBreak/>
-        <w:t>Lưu ý: TV1 duy trì nhánh tích hợp ổn định. PR chỉ được merge khi đạt test, build, migration/Docker và review. Mọi điều chỉnh phạm vi hoặc người phụ trách phải được ghi nhận trong PR.</w:t>
+        <w:t>Lưu ý: TV1 duy trì nhánh tích hợp ổn định. TV2, TV3 và TV4 tự clone repo, tạo branch, push branch và mở PR; TV1 review/tích hợp. PR chỉ được merge khi đạt test, build, migration/Docker và review. Mọi điều chỉnh phạm vi hoặc người phụ trách phải được ghi nhận trong PR.</w:t>
       </w:r>
     </w:p>
     <w:sectPr>

</xml_diff>